<commit_message>
Thực hành 2: Hoàn thành Todo Mini App (state, list, input) và cập nhật báo cáo
</commit_message>
<xml_diff>
--- a/Luyện tập 2/BuiDuyThanh_LuyenTap2.docx
+++ b/Luyện tập 2/BuiDuyThanh_LuyenTap2.docx
@@ -2682,6 +2682,122 @@
         <w:t xml:space="preserve"> giúp nhóm phát triển chia sẻ phần lớn mã nguồn, tiết kiệm tối đa thời gian lập trình, bảo trì thuận lợi và đưa ứng dụng tiếp cận trọn vẹn toàn thể sinh viên trên cả hai kho ứng dụng.</w:t>
       </w:r>
     </w:p>
+    <w:p/>
+    <w:p>
+      <w:r>
+        <w:rPr>
+          <w:b/>
+          <w:sz w:val="28"/>
+        </w:rPr>
+        <w:t>C. THỰC HÀNH: TODO MINI VỚI STATE, LIST VÀ INPUT</w:t>
+      </w:r>
+    </w:p>
+    <w:p>
+      <w:r>
+        <w:t>1. Mục tiêu thực hành:</w:t>
+      </w:r>
+    </w:p>
+    <w:p>
+      <w:r>
+        <w:t xml:space="preserve">   • Tạo màn hình Todo gồm danh sách công việc, ô nhập (TextInput) và nút Add (+ Thêm).</w:t>
+      </w:r>
+    </w:p>
+    <w:p>
+      <w:r>
+        <w:t xml:space="preserve">   • Lưu danh sách todo vào React State dạng mảng để giao diện tự động cập nhật theo dữ liệu.</w:t>
+      </w:r>
+    </w:p>
+    <w:p>
+      <w:r>
+        <w:t xml:space="preserve">   • Hiển thị và tối ưu hóa danh sách công việc bằng component FlatList.</w:t>
+      </w:r>
+    </w:p>
+    <w:p>
+      <w:r>
+        <w:t xml:space="preserve">   • Cài đặt tính năng xoá item bằng phương thức filter theo id duy nhất.</w:t>
+      </w:r>
+    </w:p>
+    <w:p>
+      <w:r>
+        <w:t xml:space="preserve">   • Định dạng giao diện chuẩn đẹp với style đầy đủ (padding, border, spacing, shadow).</w:t>
+      </w:r>
+    </w:p>
+    <w:p>
+      <w:r>
+        <w:t>2. Các bước triển khai dự án:</w:t>
+      </w:r>
+    </w:p>
+    <w:p>
+      <w:r>
+        <w:t xml:space="preserve">   • Thư mục dự án: Luyện tập 2/TodoApp</w:t>
+      </w:r>
+    </w:p>
+    <w:p>
+      <w:r>
+        <w:t xml:space="preserve">   • Khởi chạy dự án: cd "Luyện tập 2/TodoApp" &amp;&amp; npx expo start</w:t>
+      </w:r>
+    </w:p>
+    <w:p>
+      <w:r>
+        <w:t xml:space="preserve">   • Mở ứng dụng trên thiết bị di động thông qua ứng dụng Expo Go.</w:t>
+      </w:r>
+    </w:p>
+    <w:p>
+      <w:r>
+        <w:t>3. Kết quả chạy thực tế trên thiết bị di động (Tối thiểu 3 item):</w:t>
+      </w:r>
+    </w:p>
+    <w:p>
+      <w:pPr>
+        <w:jc w:val="center"/>
+      </w:pPr>
+      <w:r>
+        <w:drawing>
+          <wp:inline xmlns:a="http://schemas.openxmlformats.org/drawingml/2006/main" xmlns:pic="http://schemas.openxmlformats.org/drawingml/2006/picture">
+            <wp:extent cx="2560320" cy="5554593"/>
+            <wp:docPr id="1" name="Picture 1"/>
+            <wp:cNvGraphicFramePr>
+              <a:graphicFrameLocks noChangeAspect="1"/>
+            </wp:cNvGraphicFramePr>
+            <a:graphic>
+              <a:graphicData uri="http://schemas.openxmlformats.org/drawingml/2006/picture">
+                <pic:pic>
+                  <pic:nvPicPr>
+                    <pic:cNvPr id="0" name="screenshot_buoi2.png"/>
+                    <pic:cNvPicPr/>
+                  </pic:nvPicPr>
+                  <pic:blipFill>
+                    <a:blip r:embed="rId8"/>
+                    <a:stretch>
+                      <a:fillRect/>
+                    </a:stretch>
+                  </pic:blipFill>
+                  <pic:spPr>
+                    <a:xfrm>
+                      <a:off x="0" y="0"/>
+                      <a:ext cx="2560320" cy="5554593"/>
+                    </a:xfrm>
+                    <a:prstGeom prst="rect"/>
+                  </pic:spPr>
+                </pic:pic>
+              </a:graphicData>
+            </a:graphic>
+          </wp:inline>
+        </w:drawing>
+      </w:r>
+    </w:p>
+    <w:p>
+      <w:pPr>
+        <w:jc w:val="center"/>
+      </w:pPr>
+      <w:r>
+        <w:rPr>
+          <w:i/>
+          <w:sz w:val="20"/>
+        </w:rPr>
+        <w:t>Hình: Ứng dụng Todo Mini chạy thành công trên thiết bị di động với danh sách 3 công việc và đầy đủ tính năng Thêm / Xóa</w:t>
+      </w:r>
+    </w:p>
     <w:sectPr>
       <w:pgSz w:w="12240" w:h="15840"/>
       <w:pgMar w:top="1440" w:right="1440" w:bottom="1440" w:left="1440" w:header="720" w:footer="720" w:gutter="0"/>

</xml_diff>